<commit_message>
basic alu for single cycle cpu
</commit_message>
<xml_diff>
--- a/Docs/Project Description.docx
+++ b/Docs/Project Description.docx
@@ -461,6 +461,41 @@
         </w:rPr>
         <w:t xml:space="preserve"> Code and Run it.</w:t>
       </w:r>
+    </w:p>
+    <w:p>
+      <w:pPr>
+        <w:rPr>
+          <w:rFonts w:ascii="Arial Rounded MT Bold" w:hAnsi="Arial Rounded MT Bold"/>
+          <w:sz w:val="32"/>
+          <w:szCs w:val="32"/>
+        </w:rPr>
+      </w:pPr>
+    </w:p>
+    <w:p>
+      <w:pPr>
+        <w:rPr>
+          <w:rFonts w:ascii="Arial Rounded MT Bold" w:hAnsi="Arial Rounded MT Bold"/>
+          <w:sz w:val="32"/>
+          <w:szCs w:val="32"/>
+        </w:rPr>
+      </w:pPr>
+      <w:r>
+        <w:rPr>
+          <w:rFonts w:ascii="Arial Rounded MT Bold" w:hAnsi="Arial Rounded MT Bold"/>
+          <w:sz w:val="32"/>
+          <w:szCs w:val="32"/>
+        </w:rPr>
+        <w:t>Notes:</w:t>
+      </w:r>
+    </w:p>
+    <w:p>
+      <w:pPr>
+        <w:rPr>
+          <w:rFonts w:ascii="Arial Rounded MT Bold" w:hAnsi="Arial Rounded MT Bold"/>
+          <w:sz w:val="32"/>
+          <w:szCs w:val="32"/>
+        </w:rPr>
+      </w:pPr>
     </w:p>
     <w:sectPr>
       <w:pgSz w:w="12240" w:h="15840"/>
@@ -1232,6 +1267,7 @@
   <w:style w:type="character" w:default="1" w:styleId="DefaultParagraphFont">
     <w:name w:val="Default Paragraph Font"/>
     <w:uiPriority w:val="1"/>
+    <w:semiHidden/>
     <w:unhideWhenUsed/>
   </w:style>
   <w:style w:type="table" w:default="1" w:styleId="TableNormal">

</xml_diff>